<commit_message>
estado previo a la creacion del motor de generacion de horarios
</commit_message>
<xml_diff>
--- a/docs/AcaPlan_PWA_Historias_y_Planificacion_SCRUM.docx
+++ b/docs/AcaPlan_PWA_Historias_y_Planificacion_SCRUM.docx
@@ -82,7 +82,7 @@
     </w:p>
     <w:p>
       <w:r>
-        <w:t>Administración gestiona cuentas y permisos. Coordinación registra la asignación académica y las necesidades de espacios de sus carreras; consulta restricciones. Solo jefaturas registran restricciones autorizadas. El encargado de planificación construye y corrige borradores; las funciones autorizadas aprueban y publican. Docentes consultan y descargan borradores compartidos y horarios oficiales, sin editarlos. La denominación institucional del encargado puede precisarse después.</w:t>
+        <w:t>Administración gestiona cuentas y permisos. Los coordinadores de carrera registran la asignación académica y las necesidades de espacios de sus carreras; consulta restricciones. Solo los jefes de departamento registran restricciones autorizadas. El encargado de planificación construye y corrige borradores; las funciones autorizadas aprueban y publican. Docentes consultan y descargan borradores compartidos y horarios oficiales, sin editarlos. La denominación institucional del encargado puede precisarse después.</w:t>
       </w:r>
     </w:p>
     <w:p>
@@ -130,7 +130,12 @@
     </w:p>
     <w:p>
       <w:r>
-        <w:t>Antes de iniciar cada sprint se contrasta el código con estos criterios y se estima solo lo pendiente. El diagnóstico local de huecos ya existe parcialmente, pero H15 no se considera cerrado: aún debe aplicarse por cuadrícula y a todo el flujo. Cédula o INSS queda pendiente antes de imponer obligatoriedad o unicidad.</w:t>
+        <w:t>Decisión provisional del 12 de octubre de 2026: Medicina y Bioanálisis conservan las reglas generales de duración y frecuencia de su turno. No implementar excepciones especiales hasta recibir una definición institucional.</w:t>
+      </w:r>
+    </w:p>
+    <w:p>
+      <w:r>
+        <w:t>Antes de iniciar cada sprint se contrasta el código con estos criterios y se estima solo lo pendiente. El diagnóstico local de huecos ya existe parcialmente, pero H15 no se considera cerrado: aún debe aplicarse por cuadrícula y a todo el flujo. La decisión final del usuario es utilizar cédula como identificador del docente. No implementar la migración a INS propuesta anteriormente.</w:t>
       </w:r>
     </w:p>
     <w:p>
@@ -1405,13 +1410,9 @@
               <w:spacing w:after="70" w:line="240" w:lineRule="auto"/>
             </w:pPr>
             <w:r>
-              <w:rPr>
-                <w:rFonts w:ascii="Times New Roman" w:hAnsi="Times New Roman" w:cs="Times New Roman" w:eastAsia="Times New Roman"/>
-                <w:sz w:val="24"/>
-              </w:rPr>
-              <w:t>CA1. Validar nombre, correo y función; rechazar correo duplicado. La obligatoriedad y unicidad de cédula o INSS queda pendiente de confirmación.</w:t>
+              <w:t>CA1. Validar nombre, correo y función; rechazar correo duplicado. Usar la cédula como identificador del docente, conservándola como texto. Separar el registro académico importado de la cuenta de acceso.</w:t>
               <w:br/>
-              <w:t>CA2. Coordinación registra asignaciones y necesidades de espacio de sus carreras; consulta restricciones sin modificarlas. Solo jefaturas registran restricciones académicas.</w:t>
+              <w:t>CA2. Los coordinadores de carrera registran asignaciones y necesidades de espacio de sus carreras; consulta restricciones sin modificarlas. Solo los jefes de departamento registran restricciones académicas.</w:t>
               <w:br/>
               <w:t>CA3. Administración gestiona cuentas y habilita al encargado de planificación y aprobación. Docentes consultan y descargan horarios compartidos sin editar.</w:t>
               <w:br/>
@@ -4704,11 +4705,7 @@
               <w:spacing w:after="70" w:line="240" w:lineRule="auto"/>
             </w:pPr>
             <w:r>
-              <w:rPr>
-                <w:rFonts w:ascii="Times New Roman" w:hAnsi="Times New Roman" w:cs="Times New Roman" w:eastAsia="Times New Roman"/>
-                <w:sz w:val="24"/>
-              </w:rPr>
-              <w:t>CA1. Solo jefaturas registran o modifican restricciones; coordinación consulta. Conservar período, docente o grupo afectado, condición y responsable.</w:t>
+              <w:t>CA1. Solo los jefes de departamento registran o modifican restricciones; coordinación consulta. Conservar período, docente o grupo afectado, condición y responsable.</w:t>
               <w:br/>
               <w:t>CA2. Si no se comunica restricción, no bloquear ni exigir disponibilidad pendiente; respetar siempre cruces y otras reglas.</w:t>
               <w:br/>
@@ -17262,6 +17259,42 @@
     <w:p>
       <w:r>
         <w:t>El cierre recorre asignación, restricciones, generación, fijación, autorización, revisión y publicación; incluye PWA y consultas móviles, pérdida de conexión, permisos y conservación de datos.</w:t>
+      </w:r>
+    </w:p>
+    <w:p>
+      <w:pPr>
+        <w:pStyle w:val="Heading1"/>
+      </w:pPr>
+      <w:r>
+        <w:t>Estado verificado del 12 de octubre de 2026</w:t>
+      </w:r>
+    </w:p>
+    <w:p>
+      <w:r>
+        <w:t>Importación académica y registro de restricciones sin cuenta implementados. El flujo de horarios sigue pendiente de adaptación; persisten validadores antiguos de 80 minutos y disponibilidad positiva. La entrega se realiza mediante un único Excel, con carrera, año y turno. Inventario, datos adicionales de los años y correcciones de asignaciones continúan pendientes.</w:t>
+      </w:r>
+    </w:p>
+    <w:p>
+      <w:pPr>
+        <w:pStyle w:val="Heading1"/>
+      </w:pPr>
+      <w:r>
+        <w:t>Entrega única del coordinador 12 de octubre de 2026</w:t>
+      </w:r>
+    </w:p>
+    <w:p>
+      <w:r>
+        <w:t>Asignación académica tiene una única plantilla provisional y una única carga de Excel por coordinador. El archivo contiene cédula y nombre del docente, código y nombre de asignatura, carrera, año, turno y horas totales del semestre. La confirmación guarda sus relaciones en el modelo académico existente. La consulta permite filtrar carrera, año y turno. Se retiraron las pestañas de carga separadas, el tipo de archivo anos del backend y el resumen de programación histórica del recorrido principal. Los datos anteriores de grupos y tiempos se conservan en una sección secundaria, sin carga de Excel.</w:t>
+      </w:r>
+    </w:p>
+    <w:p>
+      <w:r>
+        <w:t>No se cambió Supabase ni la app móvil en este ajuste. Año y turno ya se guardaban en la importación académica; no se crearon secciones históricas, matrícula, sedes ni necesidades de espacio por inferencia. Esos datos adicionales siguen pendientes de integración en el flujo único. El inventario de aulas conserva su importación independiente. El compañero desarrolla el motor de generación; esta línea de trabajo continúa con la PWA, permisos, preparación de datos y revisión por sprints.</w:t>
+      </w:r>
+    </w:p>
+    <w:p>
+      <w:r>
+        <w:t>Validación del incremento: 110 pruebas backend y 73 frontend aprobadas; lint, compilación y arranque correctos. Incluye confirmación de un solo archivo y actualización conjunta de docentes, asignaturas, año y turno, filtros por semestre y recuperación de errores. No se hicieron escrituras de prueba en producción. No se declaran cerrados los sprints.</w:t>
       </w:r>
     </w:p>
     <w:sectPr>

</xml_diff>